<commit_message>
docs: regenerate detailed Wynime plan DOCX
</commit_message>
<xml_diff>
--- a/docs/Wynime_完整應用計畫與技術規格_v0.3.docx
+++ b/docs/Wynime_完整應用計畫與技術規格_v0.3.docx
@@ -122,7 +122,7 @@
         <w:t>來源 Commit：</w:t>
       </w:r>
       <w:r>
-        <w:t>fba9e28c5eaa5cc817da24fdbcefafddb2d6d8fd</w:t>
+        <w:t>234c0757d08b6659efa46a95b1879149188a8f38</w:t>
       </w:r>
     </w:p>
     <w:p>
@@ -133,7 +133,7 @@
         <w:t>產生時間：</w:t>
       </w:r>
       <w:r>
-        <w:t>2026-08-01 18:00 UTC</w:t>
+        <w:t>2026-08-01 18:01 UTC</w:t>
       </w:r>
     </w:p>
     <w:p>
@@ -1983,6 +1983,28 @@
       </w:pPr>
       <w:r>
         <w:t>Relevant feature docs and tests</w:t>
+      </w:r>
+    </w:p>
+    <w:p>
+      <w:r>
+        <w:rPr>
+          <w:rFonts w:ascii="Consolas" w:hAnsi="Consolas" w:eastAsia="Consolas"/>
+          <w:sz w:val="18"/>
+        </w:rPr>
+        <w:t>docs/Wynime_完整應用計畫與技術規格_v0.3.docx</w:t>
+      </w:r>
+      <w:r>
+        <w:t xml:space="preserve"> is the detailed human-review snapshot. It is useful for full-plan review, but it is not the machine-readable source of truth. If the DOCX conflicts with Markdown or an accepted architecture decision, Markdown and </w:t>
+      </w:r>
+      <w:r>
+        <w:rPr>
+          <w:rFonts w:ascii="Consolas" w:hAnsi="Consolas" w:eastAsia="Consolas"/>
+          <w:sz w:val="18"/>
+        </w:rPr>
+        <w:t>docs/DECISIONS.md</w:t>
+      </w:r>
+      <w:r>
+        <w:t xml:space="preserve"> win. Update Markdown first, then regenerate the DOCX through the repository workflow.</w:t>
       </w:r>
     </w:p>
     <w:p>

</xml_diff>

<commit_message>
release: prepare Wynime 1.0.7
</commit_message>
<xml_diff>
--- a/docs/Wynime_完整應用計畫與技術規格_v0.3.docx
+++ b/docs/Wynime_完整應用計畫與技術規格_v0.3.docx
@@ -113,12 +113,12 @@
     </w:p>
     <w:p>
       <w:r>
-        <w:t>來源 Commit：94c671779297aca2dd42b2c73e19f89504ab5e0c</w:t>
-      </w:r>
-    </w:p>
-    <w:p>
-      <w:r>
-        <w:t>產生時間：2026-09-10 04:38 UTC</w:t>
+        <w:t>來源：目前 checkout 的 Git 管理 Markdown／ADR</w:t>
+      </w:r>
+    </w:p>
+    <w:p>
+      <w:r>
+        <w:t>輸出：可重現的文件快照，由 CI 重新產生驗證</w:t>
       </w:r>
     </w:p>
     <w:p>
@@ -1386,7 +1386,23 @@
         <w:pStyle w:val="ListBullet"/>
       </w:pPr>
       <w:r>
-        <w:t>重試具備指數退避、最大嘗試次數與不可重試錯誤的 fail-closed 邊界；</w:t>
+        <w:t>重試具備含 jitter 的封頂指數退避；前景嘗試上限不得把可恢復錯誤變成永久佇列終點，只有結構無法執行的操作才進入可見 blocked 狀態；</w:t>
+      </w:r>
+    </w:p>
+    <w:p>
+      <w:pPr>
+        <w:pStyle w:val="ListBullet"/>
+      </w:pPr>
+      <w:r>
+        <w:t>每個本機操作在寫入前讀取最新遠端狀態，寫入後以 bounded read-after-write verification 確認 desired state；</w:t>
+      </w:r>
+    </w:p>
+    <w:p>
+      <w:pPr>
+        <w:pStyle w:val="ListBullet"/>
+      </w:pPr>
+      <w:r>
+        <w:t>明確同步／重新整理會匯入沒有衝突本機意圖的外部 Bangumi 變更，並保留 pending／retryWaiting 的 local-first 顯示語義；</w:t>
       </w:r>
     </w:p>
     <w:p>
@@ -4172,7 +4188,7 @@
     </w:p>
     <w:p>
       <w:r>
-        <w:t xml:space="preserve">Drift schema version 3 stores local collection status and remote revision, watched episode rows, an account-scoped calendar cache with its last-refresh timestamp, manual local-to-Bangumi subject mappings and </w:t>
+        <w:t xml:space="preserve">Drift schema version 4 stores local collection status and remote revision, watched episode rows, an account-scoped calendar cache with its last-refresh timestamp, manual local-to-Bangumi subject mappings and </w:t>
       </w:r>
       <w:r>
         <w:rPr>
@@ -4182,7 +4198,72 @@
         <w:t>BangumiSyncOperation</w:t>
       </w:r>
       <w:r>
-        <w:t xml:space="preserve"> rows. The sync service updates local state immediately for offline use, then persists a queued operation. Queue recovery selects only queued or due retryable failures below the configured attempt limit. Authorization, malformed payload, unsupported HTTP and exhausted retry failures remain visible rather than being silently retried forever. Remote revision conflicts remain visible and can be resolved by applying the remote state or by requeueing the local mutation against the newly fetched revision. A reauthentication-required session may still render the cached calendar, but the presentation labels it as cached rather than current.</w:t>
+        <w:t xml:space="preserve"> rows. Operations use </w:t>
+      </w:r>
+      <w:r>
+        <w:rPr>
+          <w:rFonts w:ascii="Consolas" w:hAnsi="Consolas" w:eastAsia="Consolas"/>
+          <w:sz w:val="18"/>
+        </w:rPr>
+        <w:t>pending</w:t>
+      </w:r>
+      <w:r>
+        <w:t xml:space="preserve">, </w:t>
+      </w:r>
+      <w:r>
+        <w:rPr>
+          <w:rFonts w:ascii="Consolas" w:hAnsi="Consolas" w:eastAsia="Consolas"/>
+          <w:sz w:val="18"/>
+        </w:rPr>
+        <w:t>retryWaiting</w:t>
+      </w:r>
+      <w:r>
+        <w:t xml:space="preserve">, </w:t>
+      </w:r>
+      <w:r>
+        <w:rPr>
+          <w:rFonts w:ascii="Consolas" w:hAnsi="Consolas" w:eastAsia="Consolas"/>
+          <w:sz w:val="18"/>
+        </w:rPr>
+        <w:t>conflict</w:t>
+      </w:r>
+      <w:r>
+        <w:t xml:space="preserve"> and </w:t>
+      </w:r>
+      <w:r>
+        <w:rPr>
+          <w:rFonts w:ascii="Consolas" w:hAnsi="Consolas" w:eastAsia="Consolas"/>
+          <w:sz w:val="18"/>
+        </w:rPr>
+        <w:t>blocked</w:t>
+      </w:r>
+      <w:r>
+        <w:t xml:space="preserve">; the v1.0.6 </w:t>
+      </w:r>
+      <w:r>
+        <w:rPr>
+          <w:rFonts w:ascii="Consolas" w:hAnsi="Consolas" w:eastAsia="Consolas"/>
+          <w:sz w:val="18"/>
+        </w:rPr>
+        <w:t>failed</w:t>
+      </w:r>
+      <w:r>
+        <w:t xml:space="preserve"> state is migration-only. Each operation retains its target-field base value and the latest safe HTTP status diagnostic. The sync service updates local state immediately for offline use, then persists a coalesced queued operation. Automatic selection respects </w:t>
+      </w:r>
+      <w:r>
+        <w:rPr>
+          <w:rFonts w:ascii="Consolas" w:hAnsi="Consolas" w:eastAsia="Consolas"/>
+          <w:sz w:val="18"/>
+        </w:rPr>
+        <w:t>nextAttemptAt</w:t>
+      </w:r>
+      <w:r>
+        <w:t>, while manual synchronization can force unfinished retry rows. Retryable network, timeout, provider, payload and 429／5xx failures remain retryable after any foreground attempt limit, with capped exponential backoff and jitter.</w:t>
+      </w:r>
+    </w:p>
+    <w:p>
+      <w:r>
+        <w:t>Every unfinished operation reads the applicable Bangumi state before mutation. If the target already matches, the operation completes without a write; an independent change to another target field is merged, while an incompatible target change becomes a visible conflict. Successful mutations are followed by a bounded read-after-write verification sequence before completion. Explicit collection refreshes also pull remote state for remote, cached and queued subjects, importing external Bangumi changes when no active local intent conflicts. Blocked and legacy failed rows never participate in local-first overlays. A reauthentication-required session may still render the cached calendar, but the presentation labels it as cached rather than current.</w:t>
       </w:r>
     </w:p>
     <w:p>
@@ -5916,7 +5997,7 @@
         <w:t>BangumiSyncOperation</w:t>
       </w:r>
       <w:r>
-        <w:t xml:space="preserve"> records the exact mutation, base remote revision, retry state and conflict state.</w:t>
+        <w:t xml:space="preserve"> records the exact mutation, base remote revision, target-field base value, retry state, diagnostic status code and conflict or blocked state.</w:t>
       </w:r>
     </w:p>
     <w:p>
@@ -5958,7 +6039,37 @@
         <w:t>/oauth/app-callback</w:t>
       </w:r>
       <w:r>
-        <w:t>, so the final app state cannot be parsed as a second provider state. Response size, episode page size, retries and exponential backoff are bounded. Authorization, malformed payload, exhausted retry and remote-revision failures remain visible. Conflict resolution either applies the fetched remote state or requeues the local mutation against the fetched revision. The platform handoff store contains only one bounded, one-time OAuth state and its creation time, and the client clears it on mismatch, denial, ticket failure or successful redeem; it is not a token store. The Android session store contains only encrypted refresh-session ciphertext and IV; it never stores access tokens, client secrets, cookies or raw response text. Sign-out, provider rejection, account mismatch and invalid ciphertext clear the stored refresh session. A provider can still revoke or expire a refresh token, so this is automatic reauthentication rather than an unbreakable permanent login. No live OAuth account or upstream success is inferred from fixture tests.</w:t>
+        <w:t xml:space="preserve">, so the final app state cannot be parsed as a second provider state. Response size, episode page size, retries and capped jittered exponential backoff are bounded. Every unfinished local operation reads remote state before mutation and verifies the desired state after mutation. Network, timeout, provider, payload and 429／5xx failures remain in </w:t>
+      </w:r>
+      <w:r>
+        <w:rPr>
+          <w:rFonts w:ascii="Consolas" w:hAnsi="Consolas" w:eastAsia="Consolas"/>
+          <w:sz w:val="18"/>
+        </w:rPr>
+        <w:t>retryWaiting</w:t>
+      </w:r>
+      <w:r>
+        <w:t xml:space="preserve"> after foreground limits; only structurally impossible operations enter </w:t>
+      </w:r>
+      <w:r>
+        <w:rPr>
+          <w:rFonts w:ascii="Consolas" w:hAnsi="Consolas" w:eastAsia="Consolas"/>
+          <w:sz w:val="18"/>
+        </w:rPr>
+        <w:t>blocked</w:t>
+      </w:r>
+      <w:r>
+        <w:t xml:space="preserve">, and v1.0.6 </w:t>
+      </w:r>
+      <w:r>
+        <w:rPr>
+          <w:rFonts w:ascii="Consolas" w:hAnsi="Consolas" w:eastAsia="Consolas"/>
+          <w:sz w:val="18"/>
+        </w:rPr>
+        <w:t>failed</w:t>
+      </w:r>
+      <w:r>
+        <w:t xml:space="preserve"> rows are migrated. Explicit refresh imports remote-only changes, safely merges independent fields and records incompatible target changes as conflicts. Conflict resolution either applies the fetched remote state or requeues the local mutation against the fetched revision. The platform handoff store contains only one bounded, one-time OAuth state and its creation time, and the client clears it on mismatch, denial, ticket failure or successful redeem; it is not a token store. The Android session store contains only encrypted refresh-session ciphertext and IV; it never stores access tokens, client secrets, cookies or raw response text. Sign-out, provider rejection, account mismatch and invalid ciphertext clear the stored refresh session. A provider can still revoke or expire a refresh token, so this is automatic reauthentication rather than an unbreakable permanent login. No live OAuth account or upstream success is inferred from fixture tests.</w:t>
       </w:r>
     </w:p>
     <w:p>

</xml_diff>